<commit_message>
fix: correct department name typo, use official contracting terms, and write full title of Decree 1808
</commit_message>
<xml_diff>
--- a/Технічна_документація_Порталу.docx
+++ b/Технічна_документація_Порталу.docx
@@ -377,7 +377,7 @@
                 <w:rFonts w:ascii="Segoe UI" w:hAnsi="Segoe UI"/>
                 <w:sz w:val="20"/>
               </w:rPr>
-              <w:t>Директорія модуля пошуку в нормах постанови та Порядку № 1808. Містить index.html, resolution.js та resolution.css.</w:t>
+              <w:t>Директорія модуля пошуку в нормах постанови Кабінету Міністрів України від 31.12.2025 № 1808 (якою затверджено Порядок реалізації програми державних гарантій медичного обслуговування населення у 2026 році). Містить index.html, resolution.js та resolution.css.</w:t>
             </w:r>
           </w:p>
         </w:tc>
@@ -1023,7 +1023,7 @@
         <w:br/>
         <w:t>• Алгоритми: Швидкий пошук за кодами хвороб (NK 025), вивантаження тексту висновку для швидкого копіювання.</w:t>
         <w:br/>
-        <w:t>• Постанова № 1808: Контекстний пошук за пунктами постанови та додатками з інтегрованими формулами розрахунку.</w:t>
+        <w:t>• Постанова № 1808: Контекстний пошук за пунктами постанови Кабінету Міністрів України від 31.12.2025 № 1808, якою затверджено Порядок реалізації програми державних гарантій медичного обслуговування населення у 2026 році (надалі — Порядок реалізації ПМГ у 2026 році). Пошук здійснюється за пунктами постанови та додатками з інтегрованими формулами розрахунку.</w:t>
         <w:br/>
         <w:t>• Договори ЗоЗ: Візуалізація договорів на карті України (Leaflet MarkerCluster) з фільтрацією за областями, пакетами медичних послуг, типом спроможної мережі та формами власності. Реалізовано експорт відфільтрованих договорів у Microsoft Excel (xlsx.js) та вивантаження списку електронних адрес ЗОЗ для розсилок.</w:t>
       </w:r>

</xml_diff>